<commit_message>
overall summary of the to integrate Pyspark with redshift using jdbc driver
</commit_message>
<xml_diff>
--- a/New folder/Spark-Jdbc-Redshift.docx
+++ b/New folder/Spark-Jdbc-Redshift.docx
@@ -926,7 +926,116 @@
       </w:pPr>
     </w:p>
     <w:p/>
-    <w:p/>
+    <w:p>
+      <w:pPr>
+        <w:rPr>
+          <w:b/>
+          <w:bCs/>
+          <w:lang w:val="en-US"/>
+        </w:rPr>
+      </w:pPr>
+      <w:r>
+        <w:rPr>
+          <w:b/>
+          <w:bCs/>
+          <w:lang w:val="en-US"/>
+        </w:rPr>
+        <w:lastRenderedPageBreak/>
+        <w:t>Conclusion</w:t>
+      </w:r>
+    </w:p>
+    <w:p>
+      <w:pPr>
+        <w:rPr>
+          <w:b/>
+          <w:bCs/>
+          <w:lang w:val="en-US"/>
+        </w:rPr>
+      </w:pPr>
+    </w:p>
+    <w:p>
+      <w:pPr>
+        <w:rPr>
+          <w:lang w:val="en-US"/>
+        </w:rPr>
+      </w:pPr>
+      <w:r>
+        <w:rPr>
+          <w:lang w:val="en-US"/>
+        </w:rPr>
+        <w:t xml:space="preserve">In this project, I learned how to integrate Amazon Redshift with </w:t>
+      </w:r>
+      <w:proofErr w:type="spellStart"/>
+      <w:r>
+        <w:rPr>
+          <w:lang w:val="en-US"/>
+        </w:rPr>
+        <w:t>PySpark</w:t>
+      </w:r>
+      <w:proofErr w:type="spellEnd"/>
+      <w:r>
+        <w:rPr>
+          <w:lang w:val="en-US"/>
+        </w:rPr>
+        <w:t xml:space="preserve"> using the JDBC driver to read and write data between the two platforms. I practiced connecting </w:t>
+      </w:r>
+      <w:proofErr w:type="spellStart"/>
+      <w:r>
+        <w:rPr>
+          <w:lang w:val="en-US"/>
+        </w:rPr>
+        <w:t>PySpark</w:t>
+      </w:r>
+      <w:proofErr w:type="spellEnd"/>
+      <w:r>
+        <w:rPr>
+          <w:lang w:val="en-US"/>
+        </w:rPr>
+        <w:t xml:space="preserve"> to Redshift, reading data from an existing Redshift table into a Spark </w:t>
+      </w:r>
+      <w:proofErr w:type="spellStart"/>
+      <w:r>
+        <w:rPr>
+          <w:lang w:val="en-US"/>
+        </w:rPr>
+        <w:t>DataFrame</w:t>
+      </w:r>
+      <w:proofErr w:type="spellEnd"/>
+      <w:r>
+        <w:rPr>
+          <w:lang w:val="en-US"/>
+        </w:rPr>
+        <w:t xml:space="preserve">, and writing </w:t>
+      </w:r>
+      <w:proofErr w:type="spellStart"/>
+      <w:r>
+        <w:rPr>
+          <w:lang w:val="en-US"/>
+        </w:rPr>
+        <w:t>DataFrame</w:t>
+      </w:r>
+      <w:proofErr w:type="spellEnd"/>
+      <w:r>
+        <w:rPr>
+          <w:lang w:val="en-US"/>
+        </w:rPr>
+        <w:t xml:space="preserve"> records into a Redshift table. This integration helps process and transform large datasets using Spark while leveraging Redshift for data warehousing and SQL-based analytics. Overall, this exercise provided practical experience with JDBC connectivity and data exchange between </w:t>
+      </w:r>
+      <w:proofErr w:type="spellStart"/>
+      <w:r>
+        <w:rPr>
+          <w:lang w:val="en-US"/>
+        </w:rPr>
+        <w:t>PySpark</w:t>
+      </w:r>
+      <w:proofErr w:type="spellEnd"/>
+      <w:r>
+        <w:rPr>
+          <w:lang w:val="en-US"/>
+        </w:rPr>
+        <w:t xml:space="preserve"> and Amazon Redshift.</w:t>
+      </w:r>
+    </w:p>
     <w:p/>
     <w:sectPr>
       <w:pgSz w:w="11909" w:h="16834"/>

</xml_diff>

<commit_message>
About jdbc driver and its purpose explained
</commit_message>
<xml_diff>
--- a/New folder/Spark-Jdbc-Redshift.docx
+++ b/New folder/Spark-Jdbc-Redshift.docx
@@ -941,6 +941,59 @@
           <w:lang w:val="en-US"/>
         </w:rPr>
         <w:lastRenderedPageBreak/>
+        <w:t>What is JDBC?</w:t>
+      </w:r>
+    </w:p>
+    <w:p>
+      <w:pPr>
+        <w:rPr>
+          <w:lang w:val="en-US"/>
+        </w:rPr>
+      </w:pPr>
+      <w:r>
+        <w:rPr>
+          <w:lang w:val="en-US"/>
+        </w:rPr>
+        <w:t xml:space="preserve">JDBC (Java Database Connectivity) is an API that allows applications to connect to databases, execute SQL queries, and retrieve or write data. It acts as a bridge between an application and a database. In this project, the Amazon Redshift JDBC driver enables </w:t>
+      </w:r>
+      <w:proofErr w:type="spellStart"/>
+      <w:r>
+        <w:rPr>
+          <w:lang w:val="en-US"/>
+        </w:rPr>
+        <w:t>PySpark</w:t>
+      </w:r>
+      <w:proofErr w:type="spellEnd"/>
+      <w:r>
+        <w:rPr>
+          <w:lang w:val="en-US"/>
+        </w:rPr>
+        <w:t xml:space="preserve"> to communicate with Amazon Redshift and exchange data between them.</w:t>
+      </w:r>
+    </w:p>
+    <w:p>
+      <w:pPr>
+        <w:rPr>
+          <w:b/>
+          <w:bCs/>
+          <w:lang w:val="en-US"/>
+        </w:rPr>
+      </w:pPr>
+    </w:p>
+    <w:p>
+      <w:pPr>
+        <w:rPr>
+          <w:b/>
+          <w:bCs/>
+          <w:lang w:val="en-US"/>
+        </w:rPr>
+      </w:pPr>
+      <w:r>
+        <w:rPr>
+          <w:b/>
+          <w:bCs/>
+          <w:lang w:val="en-US"/>
+        </w:rPr>
         <w:t>Conclusion</w:t>
       </w:r>
     </w:p>

</xml_diff>

<commit_message>
how jdbc pyspark and aws works together detailly explained
</commit_message>
<xml_diff>
--- a/New folder/Spark-Jdbc-Redshift.docx
+++ b/New folder/Spark-Jdbc-Redshift.docx
@@ -947,6 +947,15 @@
     <w:p>
       <w:pPr>
         <w:rPr>
+          <w:b/>
+          <w:bCs/>
+          <w:lang w:val="en-US"/>
+        </w:rPr>
+      </w:pPr>
+    </w:p>
+    <w:p>
+      <w:pPr>
+        <w:rPr>
           <w:lang w:val="en-US"/>
         </w:rPr>
       </w:pPr>
@@ -969,6 +978,165 @@
           <w:lang w:val="en-US"/>
         </w:rPr>
         <w:t xml:space="preserve"> to communicate with Amazon Redshift and exchange data between them.</w:t>
+      </w:r>
+    </w:p>
+    <w:p>
+      <w:pPr>
+        <w:rPr>
+          <w:b/>
+          <w:bCs/>
+          <w:lang w:val="en-US"/>
+        </w:rPr>
+      </w:pPr>
+    </w:p>
+    <w:p>
+      <w:pPr>
+        <w:rPr>
+          <w:b/>
+          <w:bCs/>
+          <w:lang w:val="en-US"/>
+        </w:rPr>
+      </w:pPr>
+    </w:p>
+    <w:p>
+      <w:pPr>
+        <w:rPr>
+          <w:b/>
+          <w:bCs/>
+          <w:lang w:val="en-US"/>
+        </w:rPr>
+      </w:pPr>
+      <w:r>
+        <w:rPr>
+          <w:b/>
+          <w:bCs/>
+          <w:lang w:val="en-US"/>
+        </w:rPr>
+        <w:t xml:space="preserve">How </w:t>
+      </w:r>
+      <w:proofErr w:type="spellStart"/>
+      <w:r>
+        <w:rPr>
+          <w:b/>
+          <w:bCs/>
+          <w:lang w:val="en-US"/>
+        </w:rPr>
+        <w:t>PySpark</w:t>
+      </w:r>
+      <w:proofErr w:type="spellEnd"/>
+      <w:r>
+        <w:rPr>
+          <w:b/>
+          <w:bCs/>
+          <w:lang w:val="en-US"/>
+        </w:rPr>
+        <w:t>, JDBC, and Redshift Work Together</w:t>
+      </w:r>
+    </w:p>
+    <w:p>
+      <w:pPr>
+        <w:rPr>
+          <w:b/>
+          <w:bCs/>
+          <w:lang w:val="en-US"/>
+        </w:rPr>
+      </w:pPr>
+    </w:p>
+    <w:p>
+      <w:pPr>
+        <w:rPr>
+          <w:lang w:val="en-US"/>
+        </w:rPr>
+      </w:pPr>
+      <w:r>
+        <w:rPr>
+          <w:lang w:val="en-US"/>
+        </w:rPr>
+        <w:t xml:space="preserve">JDBC (Java Database Connectivity) provides </w:t>
+      </w:r>
+      <w:proofErr w:type="gramStart"/>
+      <w:r>
+        <w:rPr>
+          <w:lang w:val="en-US"/>
+        </w:rPr>
+        <w:t>the</w:t>
+      </w:r>
+      <w:proofErr w:type="gramEnd"/>
+      <w:r>
+        <w:rPr>
+          <w:lang w:val="en-US"/>
+        </w:rPr>
+        <w:t xml:space="preserve"> interface that allows </w:t>
+      </w:r>
+      <w:proofErr w:type="spellStart"/>
+      <w:r>
+        <w:rPr>
+          <w:lang w:val="en-US"/>
+        </w:rPr>
+        <w:t>PySpark</w:t>
+      </w:r>
+      <w:proofErr w:type="spellEnd"/>
+      <w:r>
+        <w:rPr>
+          <w:lang w:val="en-US"/>
+        </w:rPr>
+        <w:t xml:space="preserve"> to communicate with Amazon Redshift, while the Redshift JDBC driver enables that communication. First, </w:t>
+      </w:r>
+      <w:proofErr w:type="spellStart"/>
+      <w:r>
+        <w:rPr>
+          <w:lang w:val="en-US"/>
+        </w:rPr>
+        <w:t>PySpark</w:t>
+      </w:r>
+      <w:proofErr w:type="spellEnd"/>
+      <w:r>
+        <w:rPr>
+          <w:lang w:val="en-US"/>
+        </w:rPr>
+        <w:t xml:space="preserve"> uses the JDBC driver, connection URL, username, and password to connect to Redshift. When reading data, Spark retrieves records from a specified Redshift table and loads them into a </w:t>
+      </w:r>
+      <w:proofErr w:type="spellStart"/>
+      <w:r>
+        <w:rPr>
+          <w:lang w:val="en-US"/>
+        </w:rPr>
+        <w:t>DataFrame</w:t>
+      </w:r>
+      <w:proofErr w:type="spellEnd"/>
+      <w:r>
+        <w:rPr>
+          <w:lang w:val="en-US"/>
+        </w:rPr>
+        <w:t xml:space="preserve"> for processing. When writing data, Spark sends </w:t>
+      </w:r>
+      <w:proofErr w:type="spellStart"/>
+      <w:r>
+        <w:rPr>
+          <w:lang w:val="en-US"/>
+        </w:rPr>
+        <w:t>DataFrame</w:t>
+      </w:r>
+      <w:proofErr w:type="spellEnd"/>
+      <w:r>
+        <w:rPr>
+          <w:lang w:val="en-US"/>
+        </w:rPr>
+        <w:t xml:space="preserve"> records to a Redshift table through the JDBC connection. In simple terms, </w:t>
+      </w:r>
+      <w:proofErr w:type="spellStart"/>
+      <w:r>
+        <w:rPr>
+          <w:lang w:val="en-US"/>
+        </w:rPr>
+        <w:t>PySpark</w:t>
+      </w:r>
+      <w:proofErr w:type="spellEnd"/>
+      <w:r>
+        <w:rPr>
+          <w:lang w:val="en-US"/>
+        </w:rPr>
+        <w:t xml:space="preserve"> processes the data, JDBC provides the connection interface, the JDBC driver enables communication, and Redshift stores and queries the data.</w:t>
       </w:r>
     </w:p>
     <w:p>

</xml_diff>